<commit_message>
actualizar costo del sistema
</commit_message>
<xml_diff>
--- a/doc/Costo del sistema.docx
+++ b/doc/Costo del sistema.docx
@@ -574,6 +574,821 @@
       </w:r>
       <w:r>
         <w:t> $50 - $100 USD mensuales.</w:t>
+      </w:r>
+    </w:p>
+    <w:p>
+      <w:pPr>
+        <w:rPr>
+          <w:b/>
+          <w:bCs/>
+        </w:rPr>
+      </w:pPr>
+      <w:r>
+        <w:rPr>
+          <w:b/>
+          <w:bCs/>
+        </w:rPr>
+        <w:lastRenderedPageBreak/>
+        <w:t>COSTO POR MODULOS</w:t>
+      </w:r>
+    </w:p>
+    <w:p>
+      <w:pPr>
+        <w:rPr>
+          <w:b/>
+          <w:bCs/>
+        </w:rPr>
+      </w:pPr>
+    </w:p>
+    <w:p>
+      <w:pPr>
+        <w:rPr>
+          <w:b/>
+          <w:bCs/>
+        </w:rPr>
+      </w:pPr>
+      <w:r>
+        <w:rPr>
+          <w:b/>
+          <w:bCs/>
+        </w:rPr>
+        <w:t>1. Módulo Básico (CRUD / Catálogos)</w:t>
+      </w:r>
+    </w:p>
+    <w:p>
+      <w:r>
+        <w:rPr>
+          <w:b/>
+          <w:bCs/>
+        </w:rPr>
+        <w:t>Costo Estimado:</w:t>
+      </w:r>
+      <w:r>
+        <w:t> </w:t>
+      </w:r>
+      <w:r>
+        <w:rPr>
+          <w:b/>
+          <w:bCs/>
+        </w:rPr>
+        <w:t>$200 - $350 USD</w:t>
+      </w:r>
+      <w:r>
+        <w:t> </w:t>
+      </w:r>
+      <w:r>
+        <w:rPr>
+          <w:b/>
+          <w:bCs/>
+        </w:rPr>
+        <w:t>Tiempo estimado:</w:t>
+      </w:r>
+      <w:r>
+        <w:t> </w:t>
+      </w:r>
+      <w:r>
+        <w:t>5</w:t>
+      </w:r>
+      <w:r>
+        <w:t xml:space="preserve"> - </w:t>
+      </w:r>
+      <w:r>
+        <w:t>8</w:t>
+      </w:r>
+      <w:r>
+        <w:t xml:space="preserve"> días.</w:t>
+      </w:r>
+    </w:p>
+    <w:p>
+      <w:pPr>
+        <w:numPr>
+          <w:ilvl w:val="0"/>
+          <w:numId w:val="7"/>
+        </w:numPr>
+      </w:pPr>
+      <w:r>
+        <w:rPr>
+          <w:b/>
+          <w:bCs/>
+        </w:rPr>
+        <w:t>Qué incluye:</w:t>
+      </w:r>
+      <w:r>
+        <w:t> Tablas de gestión simple donde solo se guardan, editan, eliminan y listan datos.</w:t>
+      </w:r>
+    </w:p>
+    <w:p>
+      <w:pPr>
+        <w:numPr>
+          <w:ilvl w:val="0"/>
+          <w:numId w:val="7"/>
+        </w:numPr>
+      </w:pPr>
+      <w:r>
+        <w:rPr>
+          <w:b/>
+          <w:bCs/>
+        </w:rPr>
+        <w:t>Ejemplos:</w:t>
+      </w:r>
+    </w:p>
+    <w:p>
+      <w:pPr>
+        <w:numPr>
+          <w:ilvl w:val="1"/>
+          <w:numId w:val="7"/>
+        </w:numPr>
+      </w:pPr>
+      <w:r>
+        <w:t>Módulo de "Marcas de Cauchos".</w:t>
+      </w:r>
+    </w:p>
+    <w:p>
+      <w:pPr>
+        <w:numPr>
+          <w:ilvl w:val="1"/>
+          <w:numId w:val="7"/>
+        </w:numPr>
+      </w:pPr>
+      <w:r>
+        <w:t>Módulo de "Tipos de Mantenimiento".</w:t>
+      </w:r>
+    </w:p>
+    <w:p>
+      <w:pPr>
+        <w:numPr>
+          <w:ilvl w:val="1"/>
+          <w:numId w:val="7"/>
+        </w:numPr>
+      </w:pPr>
+      <w:r>
+        <w:t>Gestión de "Departamentos de la Empresa".</w:t>
+      </w:r>
+    </w:p>
+    <w:p>
+      <w:pPr>
+        <w:numPr>
+          <w:ilvl w:val="0"/>
+          <w:numId w:val="7"/>
+        </w:numPr>
+      </w:pPr>
+      <w:r>
+        <w:rPr>
+          <w:b/>
+          <w:bCs/>
+        </w:rPr>
+        <w:t>Por qué este precio:</w:t>
+      </w:r>
+      <w:r>
+        <w:t xml:space="preserve"> Aunque la lógica es sencilla, en </w:t>
+      </w:r>
+      <w:r>
+        <w:t>la</w:t>
+      </w:r>
+      <w:r>
+        <w:t xml:space="preserve"> arquitectura </w:t>
+      </w:r>
+      <w:r>
+        <w:t>se</w:t>
+      </w:r>
+      <w:r>
+        <w:t xml:space="preserve"> crear la tabla en MySQL, el Modelo con los INSERT/UPDATE/DELETE, el Controlador para manejar las peticiones JSON y el archivo JS para conectar con </w:t>
+      </w:r>
+      <w:proofErr w:type="spellStart"/>
+      <w:r>
+        <w:t>DataTables</w:t>
+      </w:r>
+      <w:proofErr w:type="spellEnd"/>
+      <w:r>
+        <w:t>.</w:t>
+      </w:r>
+    </w:p>
+    <w:p>
+      <w:pPr>
+        <w:rPr>
+          <w:b/>
+          <w:bCs/>
+        </w:rPr>
+      </w:pPr>
+      <w:r>
+        <w:rPr>
+          <w:b/>
+          <w:bCs/>
+        </w:rPr>
+        <w:t>2. Módulo Intermedio (Procesos y Reportes)</w:t>
+      </w:r>
+    </w:p>
+    <w:p>
+      <w:r>
+        <w:rPr>
+          <w:b/>
+          <w:bCs/>
+        </w:rPr>
+        <w:t>Costo Estimado:</w:t>
+      </w:r>
+      <w:r>
+        <w:t> </w:t>
+      </w:r>
+      <w:r>
+        <w:rPr>
+          <w:b/>
+          <w:bCs/>
+        </w:rPr>
+        <w:t>$500 - $900 USD</w:t>
+      </w:r>
+      <w:r>
+        <w:t> </w:t>
+      </w:r>
+      <w:r>
+        <w:rPr>
+          <w:b/>
+          <w:bCs/>
+        </w:rPr>
+        <w:t>Tiempo estimado:</w:t>
+      </w:r>
+      <w:r>
+        <w:t> 1 - 2 semanas.</w:t>
+      </w:r>
+    </w:p>
+    <w:p>
+      <w:pPr>
+        <w:numPr>
+          <w:ilvl w:val="0"/>
+          <w:numId w:val="8"/>
+        </w:numPr>
+      </w:pPr>
+      <w:r>
+        <w:rPr>
+          <w:b/>
+          <w:bCs/>
+        </w:rPr>
+        <w:t>Qué incluye:</w:t>
+      </w:r>
+      <w:r>
+        <w:t> Lógica de negocio, cálculos matemáticos, validaciones contra inventario (como en tu </w:t>
+      </w:r>
+      <w:proofErr w:type="spellStart"/>
+      <w:r>
+        <w:t>OrdenController</w:t>
+      </w:r>
+      <w:proofErr w:type="spellEnd"/>
+      <w:r>
+        <w:t>), cambios de estado y generación de reportes PDF.</w:t>
+      </w:r>
+    </w:p>
+    <w:p>
+      <w:pPr>
+        <w:numPr>
+          <w:ilvl w:val="0"/>
+          <w:numId w:val="8"/>
+        </w:numPr>
+      </w:pPr>
+      <w:r>
+        <w:rPr>
+          <w:b/>
+          <w:bCs/>
+        </w:rPr>
+        <w:t>Ejemplos:</w:t>
+      </w:r>
+    </w:p>
+    <w:p>
+      <w:pPr>
+        <w:numPr>
+          <w:ilvl w:val="1"/>
+          <w:numId w:val="8"/>
+        </w:numPr>
+      </w:pPr>
+      <w:r>
+        <w:rPr>
+          <w:b/>
+          <w:bCs/>
+        </w:rPr>
+        <w:t>Módulo de Nómina (Básico):</w:t>
+      </w:r>
+      <w:r>
+        <w:t> Calcular pagos de choferes por viajes realizados.</w:t>
+      </w:r>
+    </w:p>
+    <w:p>
+      <w:pPr>
+        <w:numPr>
+          <w:ilvl w:val="1"/>
+          <w:numId w:val="8"/>
+        </w:numPr>
+      </w:pPr>
+      <w:r>
+        <w:rPr>
+          <w:b/>
+          <w:bCs/>
+        </w:rPr>
+        <w:t>Módulo de Citas de Taller:</w:t>
+      </w:r>
+      <w:r>
+        <w:t> Agendar reparaciones futuras y alertar.</w:t>
+      </w:r>
+    </w:p>
+    <w:p>
+      <w:pPr>
+        <w:numPr>
+          <w:ilvl w:val="1"/>
+          <w:numId w:val="8"/>
+        </w:numPr>
+      </w:pPr>
+      <w:r>
+        <w:rPr>
+          <w:b/>
+          <w:bCs/>
+        </w:rPr>
+        <w:t>Reportes Gerenciales:</w:t>
+      </w:r>
+      <w:r>
+        <w:t xml:space="preserve"> Un </w:t>
+      </w:r>
+      <w:proofErr w:type="spellStart"/>
+      <w:r>
+        <w:t>dashboard</w:t>
+      </w:r>
+      <w:proofErr w:type="spellEnd"/>
+      <w:r>
+        <w:t xml:space="preserve"> nuevo con gráficas de consumo vs. gastos.</w:t>
+      </w:r>
+    </w:p>
+    <w:p>
+      <w:pPr>
+        <w:numPr>
+          <w:ilvl w:val="0"/>
+          <w:numId w:val="8"/>
+        </w:numPr>
+      </w:pPr>
+      <w:r>
+        <w:rPr>
+          <w:b/>
+          <w:bCs/>
+        </w:rPr>
+        <w:t>Justificación técnica:</w:t>
+      </w:r>
+      <w:r>
+        <w:t> Viendo tu </w:t>
+      </w:r>
+      <w:proofErr w:type="spellStart"/>
+      <w:r>
+        <w:fldChar w:fldCharType="begin"/>
+      </w:r>
+      <w:r>
+        <w:instrText>HYPERLINK "code-assist-path:c:\\xampp\\htdocs\\BUS\\system\\app\\Models\\ComprasModel.php" \o "c:\\xampp\\htdocs\\BUS\\system\\app\\Models\\ComprasModel.php"</w:instrText>
+      </w:r>
+      <w:r>
+        <w:fldChar w:fldCharType="separate"/>
+      </w:r>
+      <w:r>
+        <w:rPr>
+          <w:rStyle w:val="Hipervnculo"/>
+        </w:rPr>
+        <w:t>ComprasModel.php</w:t>
+      </w:r>
+      <w:proofErr w:type="spellEnd"/>
+      <w:r>
+        <w:fldChar w:fldCharType="end"/>
+      </w:r>
+      <w:r>
+        <w:t>, las consultas SQL incluyen múltiples JOIN y lógica de negocio (como el manejo de la tasa del día). Hacer esto bien y probarlo lleva tiempo. Además, incluye la maquetación del PDF.</w:t>
+      </w:r>
+    </w:p>
+    <w:p/>
+    <w:p/>
+    <w:p>
+      <w:pPr>
+        <w:rPr>
+          <w:b/>
+          <w:bCs/>
+        </w:rPr>
+      </w:pPr>
+      <w:r>
+        <w:rPr>
+          <w:b/>
+          <w:bCs/>
+        </w:rPr>
+        <w:lastRenderedPageBreak/>
+        <w:t>3. Módulo Avanzado (Integraciones o Lógica Compleja)</w:t>
+      </w:r>
+    </w:p>
+    <w:p>
+      <w:r>
+        <w:rPr>
+          <w:b/>
+          <w:bCs/>
+        </w:rPr>
+        <w:t>Costo Estimado:</w:t>
+      </w:r>
+      <w:r>
+        <w:t> </w:t>
+      </w:r>
+      <w:r>
+        <w:rPr>
+          <w:b/>
+          <w:bCs/>
+        </w:rPr>
+        <w:t>$1,200 - $2,000+ USD</w:t>
+      </w:r>
+      <w:r>
+        <w:t> </w:t>
+      </w:r>
+      <w:r>
+        <w:rPr>
+          <w:b/>
+          <w:bCs/>
+        </w:rPr>
+        <w:t>Tiempo estimado:</w:t>
+      </w:r>
+      <w:r>
+        <w:t> 3 - 5 semanas.</w:t>
+      </w:r>
+    </w:p>
+    <w:p>
+      <w:pPr>
+        <w:numPr>
+          <w:ilvl w:val="0"/>
+          <w:numId w:val="9"/>
+        </w:numPr>
+      </w:pPr>
+      <w:r>
+        <w:rPr>
+          <w:b/>
+          <w:bCs/>
+        </w:rPr>
+        <w:t>Qué incluye:</w:t>
+      </w:r>
+      <w:r>
+        <w:t xml:space="preserve"> Integración con hardware, </w:t>
+      </w:r>
+      <w:proofErr w:type="spellStart"/>
+      <w:r>
+        <w:t>APIs</w:t>
+      </w:r>
+      <w:proofErr w:type="spellEnd"/>
+      <w:r>
+        <w:t xml:space="preserve"> externas o lógica contable profunda.</w:t>
+      </w:r>
+    </w:p>
+    <w:p>
+      <w:pPr>
+        <w:numPr>
+          <w:ilvl w:val="0"/>
+          <w:numId w:val="9"/>
+        </w:numPr>
+      </w:pPr>
+      <w:r>
+        <w:rPr>
+          <w:b/>
+          <w:bCs/>
+        </w:rPr>
+        <w:t>Ejemplos:</w:t>
+      </w:r>
+    </w:p>
+    <w:p>
+      <w:pPr>
+        <w:numPr>
+          <w:ilvl w:val="1"/>
+          <w:numId w:val="9"/>
+        </w:numPr>
+      </w:pPr>
+      <w:r>
+        <w:rPr>
+          <w:b/>
+          <w:bCs/>
+        </w:rPr>
+        <w:t>Integración GPS:</w:t>
+      </w:r>
+      <w:r>
+        <w:t xml:space="preserve"> Mostrar en un mapa en tiempo real dónde están las unidades (requiere API de Google </w:t>
+      </w:r>
+      <w:proofErr w:type="spellStart"/>
+      <w:r>
+        <w:t>Maps</w:t>
+      </w:r>
+      <w:proofErr w:type="spellEnd"/>
+      <w:r>
+        <w:t xml:space="preserve"> o </w:t>
+      </w:r>
+      <w:proofErr w:type="spellStart"/>
+      <w:r>
+        <w:t>Traccar</w:t>
+      </w:r>
+      <w:proofErr w:type="spellEnd"/>
+      <w:r>
+        <w:t>).</w:t>
+      </w:r>
+    </w:p>
+    <w:p>
+      <w:pPr>
+        <w:numPr>
+          <w:ilvl w:val="1"/>
+          <w:numId w:val="9"/>
+        </w:numPr>
+      </w:pPr>
+      <w:r>
+        <w:rPr>
+          <w:b/>
+          <w:bCs/>
+        </w:rPr>
+        <w:t>Facturación:</w:t>
+      </w:r>
+      <w:r>
+        <w:t> Integración con impresoras fiscales o sistemas administrativos externos (Saint, A2).</w:t>
+      </w:r>
+    </w:p>
+    <w:p>
+      <w:pPr>
+        <w:numPr>
+          <w:ilvl w:val="1"/>
+          <w:numId w:val="9"/>
+        </w:numPr>
+      </w:pPr>
+      <w:r>
+        <w:rPr>
+          <w:b/>
+          <w:bCs/>
+        </w:rPr>
+        <w:t>App Móvil para Choferes:</w:t>
+      </w:r>
+      <w:r>
+        <w:t> Una vista simplificada para que reporten fallas desde el teléfono.</w:t>
+      </w:r>
+    </w:p>
+    <w:p>
+      <w:pPr>
+        <w:rPr>
+          <w:b/>
+          <w:bCs/>
+        </w:rPr>
+      </w:pPr>
+      <w:r>
+        <w:rPr>
+          <w:b/>
+          <w:bCs/>
+        </w:rPr>
+        <w:t>Desglose del Trabajo (Para justificar el cobro al cliente)</w:t>
+      </w:r>
+    </w:p>
+    <w:p>
+      <w:r>
+        <w:t xml:space="preserve">Aquí se explica </w:t>
+      </w:r>
+      <w:r>
+        <w:t>"¿Por qué cuesta eso?", agregar un módulo en este sistema implica intervenir 5 capas de seguridad y desarrollo:</w:t>
+      </w:r>
+    </w:p>
+    <w:p>
+      <w:pPr>
+        <w:numPr>
+          <w:ilvl w:val="0"/>
+          <w:numId w:val="10"/>
+        </w:numPr>
+      </w:pPr>
+      <w:r>
+        <w:rPr>
+          <w:b/>
+          <w:bCs/>
+        </w:rPr>
+        <w:t>Base de Datos:</w:t>
+      </w:r>
+      <w:r>
+        <w:t> Diseñar y crear las tablas relacionales (MySQL).</w:t>
+      </w:r>
+    </w:p>
+    <w:p>
+      <w:pPr>
+        <w:numPr>
+          <w:ilvl w:val="0"/>
+          <w:numId w:val="10"/>
+        </w:numPr>
+      </w:pPr>
+      <w:r>
+        <w:rPr>
+          <w:b/>
+          <w:bCs/>
+        </w:rPr>
+        <w:t>Modelo (</w:t>
+      </w:r>
+      <w:proofErr w:type="spellStart"/>
+      <w:r>
+        <w:rPr>
+          <w:b/>
+          <w:bCs/>
+        </w:rPr>
+        <w:t>Backend</w:t>
+      </w:r>
+      <w:proofErr w:type="spellEnd"/>
+      <w:r>
+        <w:rPr>
+          <w:b/>
+          <w:bCs/>
+        </w:rPr>
+        <w:t>):</w:t>
+      </w:r>
+      <w:r>
+        <w:t xml:space="preserve"> Escribir las consultas SQL seguras para evitar inyecciones (como </w:t>
+      </w:r>
+      <w:r>
+        <w:t>en el</w:t>
+      </w:r>
+      <w:r>
+        <w:t xml:space="preserve"> código usando ? en las </w:t>
+      </w:r>
+      <w:proofErr w:type="spellStart"/>
+      <w:r>
+        <w:t>queries</w:t>
+      </w:r>
+      <w:proofErr w:type="spellEnd"/>
+      <w:r>
+        <w:t>).</w:t>
+      </w:r>
+    </w:p>
+    <w:p>
+      <w:pPr>
+        <w:numPr>
+          <w:ilvl w:val="0"/>
+          <w:numId w:val="10"/>
+        </w:numPr>
+      </w:pPr>
+      <w:r>
+        <w:rPr>
+          <w:b/>
+          <w:bCs/>
+        </w:rPr>
+        <w:t>Controlador (Lógica):</w:t>
+      </w:r>
+      <w:r>
+        <w:t> Programar las reglas del negocio (validar sesiones, permisos, cálculos).</w:t>
+      </w:r>
+    </w:p>
+    <w:p>
+      <w:pPr>
+        <w:numPr>
+          <w:ilvl w:val="0"/>
+          <w:numId w:val="10"/>
+        </w:numPr>
+      </w:pPr>
+      <w:r>
+        <w:rPr>
+          <w:b/>
+          <w:bCs/>
+        </w:rPr>
+        <w:t>Vista y JS (</w:t>
+      </w:r>
+      <w:proofErr w:type="spellStart"/>
+      <w:r>
+        <w:rPr>
+          <w:b/>
+          <w:bCs/>
+        </w:rPr>
+        <w:t>Frontend</w:t>
+      </w:r>
+      <w:proofErr w:type="spellEnd"/>
+      <w:r>
+        <w:rPr>
+          <w:b/>
+          <w:bCs/>
+        </w:rPr>
+        <w:t>):</w:t>
+      </w:r>
+      <w:r>
+        <w:t> Diseñar la interfaz, programar la interactividad con JavaScript (validaciones en tiempo real como las que tienes en </w:t>
+      </w:r>
+      <w:hyperlink r:id="rId5" w:tooltip="c:\xampp\htdocs\BUS\src\js\function.requisicion.js" w:history="1">
+        <w:r>
+          <w:rPr>
+            <w:rStyle w:val="Hipervnculo"/>
+          </w:rPr>
+          <w:t>function.requisicion.js</w:t>
+        </w:r>
+      </w:hyperlink>
+      <w:r>
+        <w:t>).</w:t>
+      </w:r>
+    </w:p>
+    <w:p>
+      <w:pPr>
+        <w:numPr>
+          <w:ilvl w:val="0"/>
+          <w:numId w:val="10"/>
+        </w:numPr>
+      </w:pPr>
+      <w:r>
+        <w:rPr>
+          <w:b/>
+          <w:bCs/>
+        </w:rPr>
+        <w:t>Seguridad:</w:t>
+      </w:r>
+      <w:r>
+        <w:t> Integrarlo al sistema de permisos y roles existente.</w:t>
+      </w:r>
+    </w:p>
+    <w:p>
+      <w:pPr>
+        <w:rPr>
+          <w:b/>
+          <w:bCs/>
+        </w:rPr>
+      </w:pPr>
+      <w:r>
+        <w:rPr>
+          <w:b/>
+          <w:bCs/>
+        </w:rPr>
+        <w:t>Recomendación de Negocio</w:t>
+      </w:r>
+    </w:p>
+    <w:p>
+      <w:r>
+        <w:t xml:space="preserve">Para un cliente en Venezuela, </w:t>
+      </w:r>
+      <w:r>
+        <w:t>se</w:t>
+      </w:r>
+      <w:r>
+        <w:t xml:space="preserve"> sugier</w:t>
+      </w:r>
+      <w:r>
+        <w:t>e</w:t>
+      </w:r>
+      <w:r>
+        <w:t xml:space="preserve"> manejar un </w:t>
+      </w:r>
+      <w:r>
+        <w:rPr>
+          <w:b/>
+          <w:bCs/>
+        </w:rPr>
+        <w:t>"Costo por Hora de Desarrollo"</w:t>
+      </w:r>
+      <w:r>
+        <w:t> para requerimientos pequeños y </w:t>
+      </w:r>
+      <w:r>
+        <w:rPr>
+          <w:b/>
+          <w:bCs/>
+        </w:rPr>
+        <w:t>"Costo por Proyecto Cerrado"</w:t>
+      </w:r>
+      <w:r>
+        <w:t> para módulos grandes.</w:t>
+      </w:r>
+    </w:p>
+    <w:p>
+      <w:pPr>
+        <w:numPr>
+          <w:ilvl w:val="0"/>
+          <w:numId w:val="11"/>
+        </w:numPr>
+      </w:pPr>
+      <w:r>
+        <w:rPr>
+          <w:b/>
+          <w:bCs/>
+        </w:rPr>
+        <w:t>Tarifa por hora sugerida (Soporte/Ajustes):</w:t>
+      </w:r>
+      <w:r>
+        <w:t> $15 - $25 USD/hora.</w:t>
+      </w:r>
+    </w:p>
+    <w:p>
+      <w:pPr>
+        <w:numPr>
+          <w:ilvl w:val="0"/>
+          <w:numId w:val="11"/>
+        </w:numPr>
+      </w:pPr>
+      <w:r>
+        <w:rPr>
+          <w:b/>
+          <w:bCs/>
+        </w:rPr>
+        <w:t>Paquete de Módulos:</w:t>
+      </w:r>
+      <w:r>
+        <w:t> Si te piden 3 módulos de golpe, puedes ofrecer un descuento del 10-15%.</w:t>
+      </w:r>
+    </w:p>
+    <w:p>
+      <w:r>
+        <w:rPr>
+          <w:b/>
+          <w:bCs/>
+        </w:rPr>
+        <w:t>Nota importante:</w:t>
+      </w:r>
+      <w:r>
+        <w:t> </w:t>
+      </w:r>
+      <w:r>
+        <w:t>Se debe</w:t>
+      </w:r>
+      <w:r>
+        <w:t xml:space="preserve"> cobrar el 50% por adelantado antes de empezar a codificar cualquier módulo nuevo.</w:t>
       </w:r>
     </w:p>
     <w:sectPr>
@@ -738,6 +1553,268 @@
     </w:lvl>
   </w:abstractNum>
   <w:abstractNum w:abstractNumId="1" w15:restartNumberingAfterBreak="0">
+    <w:nsid w:val="23791A87"/>
+    <w:multiLevelType w:val="multilevel"/>
+    <w:tmpl w:val="C8447D00"/>
+    <w:lvl w:ilvl="0">
+      <w:start w:val="1"/>
+      <w:numFmt w:val="decimal"/>
+      <w:lvlText w:val="%1."/>
+      <w:lvlJc w:val="left"/>
+      <w:pPr>
+        <w:tabs>
+          <w:tab w:val="num" w:pos="720"/>
+        </w:tabs>
+        <w:ind w:left="720" w:hanging="360"/>
+      </w:pPr>
+    </w:lvl>
+    <w:lvl w:ilvl="1" w:tentative="1">
+      <w:start w:val="1"/>
+      <w:numFmt w:val="decimal"/>
+      <w:lvlText w:val="%2."/>
+      <w:lvlJc w:val="left"/>
+      <w:pPr>
+        <w:tabs>
+          <w:tab w:val="num" w:pos="1440"/>
+        </w:tabs>
+        <w:ind w:left="1440" w:hanging="360"/>
+      </w:pPr>
+    </w:lvl>
+    <w:lvl w:ilvl="2" w:tentative="1">
+      <w:start w:val="1"/>
+      <w:numFmt w:val="decimal"/>
+      <w:lvlText w:val="%3."/>
+      <w:lvlJc w:val="left"/>
+      <w:pPr>
+        <w:tabs>
+          <w:tab w:val="num" w:pos="2160"/>
+        </w:tabs>
+        <w:ind w:left="2160" w:hanging="360"/>
+      </w:pPr>
+    </w:lvl>
+    <w:lvl w:ilvl="3" w:tentative="1">
+      <w:start w:val="1"/>
+      <w:numFmt w:val="decimal"/>
+      <w:lvlText w:val="%4."/>
+      <w:lvlJc w:val="left"/>
+      <w:pPr>
+        <w:tabs>
+          <w:tab w:val="num" w:pos="2880"/>
+        </w:tabs>
+        <w:ind w:left="2880" w:hanging="360"/>
+      </w:pPr>
+    </w:lvl>
+    <w:lvl w:ilvl="4" w:tentative="1">
+      <w:start w:val="1"/>
+      <w:numFmt w:val="decimal"/>
+      <w:lvlText w:val="%5."/>
+      <w:lvlJc w:val="left"/>
+      <w:pPr>
+        <w:tabs>
+          <w:tab w:val="num" w:pos="3600"/>
+        </w:tabs>
+        <w:ind w:left="3600" w:hanging="360"/>
+      </w:pPr>
+    </w:lvl>
+    <w:lvl w:ilvl="5" w:tentative="1">
+      <w:start w:val="1"/>
+      <w:numFmt w:val="decimal"/>
+      <w:lvlText w:val="%6."/>
+      <w:lvlJc w:val="left"/>
+      <w:pPr>
+        <w:tabs>
+          <w:tab w:val="num" w:pos="4320"/>
+        </w:tabs>
+        <w:ind w:left="4320" w:hanging="360"/>
+      </w:pPr>
+    </w:lvl>
+    <w:lvl w:ilvl="6" w:tentative="1">
+      <w:start w:val="1"/>
+      <w:numFmt w:val="decimal"/>
+      <w:lvlText w:val="%7."/>
+      <w:lvlJc w:val="left"/>
+      <w:pPr>
+        <w:tabs>
+          <w:tab w:val="num" w:pos="5040"/>
+        </w:tabs>
+        <w:ind w:left="5040" w:hanging="360"/>
+      </w:pPr>
+    </w:lvl>
+    <w:lvl w:ilvl="7" w:tentative="1">
+      <w:start w:val="1"/>
+      <w:numFmt w:val="decimal"/>
+      <w:lvlText w:val="%8."/>
+      <w:lvlJc w:val="left"/>
+      <w:pPr>
+        <w:tabs>
+          <w:tab w:val="num" w:pos="5760"/>
+        </w:tabs>
+        <w:ind w:left="5760" w:hanging="360"/>
+      </w:pPr>
+    </w:lvl>
+    <w:lvl w:ilvl="8" w:tentative="1">
+      <w:start w:val="1"/>
+      <w:numFmt w:val="decimal"/>
+      <w:lvlText w:val="%9."/>
+      <w:lvlJc w:val="left"/>
+      <w:pPr>
+        <w:tabs>
+          <w:tab w:val="num" w:pos="6480"/>
+        </w:tabs>
+        <w:ind w:left="6480" w:hanging="360"/>
+      </w:pPr>
+    </w:lvl>
+  </w:abstractNum>
+  <w:abstractNum w:abstractNumId="2" w15:restartNumberingAfterBreak="0">
+    <w:nsid w:val="29A718DE"/>
+    <w:multiLevelType w:val="multilevel"/>
+    <w:tmpl w:val="8A42ACD2"/>
+    <w:lvl w:ilvl="0">
+      <w:start w:val="1"/>
+      <w:numFmt w:val="bullet"/>
+      <w:lvlText w:val=""/>
+      <w:lvlJc w:val="left"/>
+      <w:pPr>
+        <w:tabs>
+          <w:tab w:val="num" w:pos="720"/>
+        </w:tabs>
+        <w:ind w:left="720" w:hanging="360"/>
+      </w:pPr>
+      <w:rPr>
+        <w:rFonts w:ascii="Symbol" w:hAnsi="Symbol" w:hint="default"/>
+        <w:sz w:val="20"/>
+      </w:rPr>
+    </w:lvl>
+    <w:lvl w:ilvl="1">
+      <w:start w:val="1"/>
+      <w:numFmt w:val="bullet"/>
+      <w:lvlText w:val="o"/>
+      <w:lvlJc w:val="left"/>
+      <w:pPr>
+        <w:tabs>
+          <w:tab w:val="num" w:pos="1440"/>
+        </w:tabs>
+        <w:ind w:left="1440" w:hanging="360"/>
+      </w:pPr>
+      <w:rPr>
+        <w:rFonts w:ascii="Courier New" w:hAnsi="Courier New" w:hint="default"/>
+        <w:sz w:val="20"/>
+      </w:rPr>
+    </w:lvl>
+    <w:lvl w:ilvl="2" w:tentative="1">
+      <w:start w:val="1"/>
+      <w:numFmt w:val="bullet"/>
+      <w:lvlText w:val=""/>
+      <w:lvlJc w:val="left"/>
+      <w:pPr>
+        <w:tabs>
+          <w:tab w:val="num" w:pos="2160"/>
+        </w:tabs>
+        <w:ind w:left="2160" w:hanging="360"/>
+      </w:pPr>
+      <w:rPr>
+        <w:rFonts w:ascii="Wingdings" w:hAnsi="Wingdings" w:hint="default"/>
+        <w:sz w:val="20"/>
+      </w:rPr>
+    </w:lvl>
+    <w:lvl w:ilvl="3" w:tentative="1">
+      <w:start w:val="1"/>
+      <w:numFmt w:val="bullet"/>
+      <w:lvlText w:val=""/>
+      <w:lvlJc w:val="left"/>
+      <w:pPr>
+        <w:tabs>
+          <w:tab w:val="num" w:pos="2880"/>
+        </w:tabs>
+        <w:ind w:left="2880" w:hanging="360"/>
+      </w:pPr>
+      <w:rPr>
+        <w:rFonts w:ascii="Wingdings" w:hAnsi="Wingdings" w:hint="default"/>
+        <w:sz w:val="20"/>
+      </w:rPr>
+    </w:lvl>
+    <w:lvl w:ilvl="4" w:tentative="1">
+      <w:start w:val="1"/>
+      <w:numFmt w:val="bullet"/>
+      <w:lvlText w:val=""/>
+      <w:lvlJc w:val="left"/>
+      <w:pPr>
+        <w:tabs>
+          <w:tab w:val="num" w:pos="3600"/>
+        </w:tabs>
+        <w:ind w:left="3600" w:hanging="360"/>
+      </w:pPr>
+      <w:rPr>
+        <w:rFonts w:ascii="Wingdings" w:hAnsi="Wingdings" w:hint="default"/>
+        <w:sz w:val="20"/>
+      </w:rPr>
+    </w:lvl>
+    <w:lvl w:ilvl="5" w:tentative="1">
+      <w:start w:val="1"/>
+      <w:numFmt w:val="bullet"/>
+      <w:lvlText w:val=""/>
+      <w:lvlJc w:val="left"/>
+      <w:pPr>
+        <w:tabs>
+          <w:tab w:val="num" w:pos="4320"/>
+        </w:tabs>
+        <w:ind w:left="4320" w:hanging="360"/>
+      </w:pPr>
+      <w:rPr>
+        <w:rFonts w:ascii="Wingdings" w:hAnsi="Wingdings" w:hint="default"/>
+        <w:sz w:val="20"/>
+      </w:rPr>
+    </w:lvl>
+    <w:lvl w:ilvl="6" w:tentative="1">
+      <w:start w:val="1"/>
+      <w:numFmt w:val="bullet"/>
+      <w:lvlText w:val=""/>
+      <w:lvlJc w:val="left"/>
+      <w:pPr>
+        <w:tabs>
+          <w:tab w:val="num" w:pos="5040"/>
+        </w:tabs>
+        <w:ind w:left="5040" w:hanging="360"/>
+      </w:pPr>
+      <w:rPr>
+        <w:rFonts w:ascii="Wingdings" w:hAnsi="Wingdings" w:hint="default"/>
+        <w:sz w:val="20"/>
+      </w:rPr>
+    </w:lvl>
+    <w:lvl w:ilvl="7" w:tentative="1">
+      <w:start w:val="1"/>
+      <w:numFmt w:val="bullet"/>
+      <w:lvlText w:val=""/>
+      <w:lvlJc w:val="left"/>
+      <w:pPr>
+        <w:tabs>
+          <w:tab w:val="num" w:pos="5760"/>
+        </w:tabs>
+        <w:ind w:left="5760" w:hanging="360"/>
+      </w:pPr>
+      <w:rPr>
+        <w:rFonts w:ascii="Wingdings" w:hAnsi="Wingdings" w:hint="default"/>
+        <w:sz w:val="20"/>
+      </w:rPr>
+    </w:lvl>
+    <w:lvl w:ilvl="8" w:tentative="1">
+      <w:start w:val="1"/>
+      <w:numFmt w:val="bullet"/>
+      <w:lvlText w:val=""/>
+      <w:lvlJc w:val="left"/>
+      <w:pPr>
+        <w:tabs>
+          <w:tab w:val="num" w:pos="6480"/>
+        </w:tabs>
+        <w:ind w:left="6480" w:hanging="360"/>
+      </w:pPr>
+      <w:rPr>
+        <w:rFonts w:ascii="Wingdings" w:hAnsi="Wingdings" w:hint="default"/>
+        <w:sz w:val="20"/>
+      </w:rPr>
+    </w:lvl>
+  </w:abstractNum>
+  <w:abstractNum w:abstractNumId="3" w15:restartNumberingAfterBreak="0">
     <w:nsid w:val="2F691222"/>
     <w:multiLevelType w:val="multilevel"/>
     <w:tmpl w:val="8D4052D0"/>
@@ -886,7 +1963,7 @@
       </w:rPr>
     </w:lvl>
   </w:abstractNum>
-  <w:abstractNum w:abstractNumId="2" w15:restartNumberingAfterBreak="0">
+  <w:abstractNum w:abstractNumId="4" w15:restartNumberingAfterBreak="0">
     <w:nsid w:val="2FA63899"/>
     <w:multiLevelType w:val="multilevel"/>
     <w:tmpl w:val="1D42C3AE"/>
@@ -1035,7 +2112,7 @@
       </w:rPr>
     </w:lvl>
   </w:abstractNum>
-  <w:abstractNum w:abstractNumId="3" w15:restartNumberingAfterBreak="0">
+  <w:abstractNum w:abstractNumId="5" w15:restartNumberingAfterBreak="0">
     <w:nsid w:val="4A08599C"/>
     <w:multiLevelType w:val="multilevel"/>
     <w:tmpl w:val="EAE6F66A"/>
@@ -1184,7 +2261,7 @@
       </w:rPr>
     </w:lvl>
   </w:abstractNum>
-  <w:abstractNum w:abstractNumId="4" w15:restartNumberingAfterBreak="0">
+  <w:abstractNum w:abstractNumId="6" w15:restartNumberingAfterBreak="0">
     <w:nsid w:val="5AC203A3"/>
     <w:multiLevelType w:val="multilevel"/>
     <w:tmpl w:val="66E25092"/>
@@ -1333,7 +2410,156 @@
       </w:rPr>
     </w:lvl>
   </w:abstractNum>
-  <w:abstractNum w:abstractNumId="5" w15:restartNumberingAfterBreak="0">
+  <w:abstractNum w:abstractNumId="7" w15:restartNumberingAfterBreak="0">
+    <w:nsid w:val="71AE66C8"/>
+    <w:multiLevelType w:val="multilevel"/>
+    <w:tmpl w:val="C9D0D228"/>
+    <w:lvl w:ilvl="0">
+      <w:start w:val="1"/>
+      <w:numFmt w:val="bullet"/>
+      <w:lvlText w:val=""/>
+      <w:lvlJc w:val="left"/>
+      <w:pPr>
+        <w:tabs>
+          <w:tab w:val="num" w:pos="720"/>
+        </w:tabs>
+        <w:ind w:left="720" w:hanging="360"/>
+      </w:pPr>
+      <w:rPr>
+        <w:rFonts w:ascii="Symbol" w:hAnsi="Symbol" w:hint="default"/>
+        <w:sz w:val="20"/>
+      </w:rPr>
+    </w:lvl>
+    <w:lvl w:ilvl="1">
+      <w:start w:val="1"/>
+      <w:numFmt w:val="bullet"/>
+      <w:lvlText w:val="o"/>
+      <w:lvlJc w:val="left"/>
+      <w:pPr>
+        <w:tabs>
+          <w:tab w:val="num" w:pos="1440"/>
+        </w:tabs>
+        <w:ind w:left="1440" w:hanging="360"/>
+      </w:pPr>
+      <w:rPr>
+        <w:rFonts w:ascii="Courier New" w:hAnsi="Courier New" w:hint="default"/>
+        <w:sz w:val="20"/>
+      </w:rPr>
+    </w:lvl>
+    <w:lvl w:ilvl="2" w:tentative="1">
+      <w:start w:val="1"/>
+      <w:numFmt w:val="bullet"/>
+      <w:lvlText w:val=""/>
+      <w:lvlJc w:val="left"/>
+      <w:pPr>
+        <w:tabs>
+          <w:tab w:val="num" w:pos="2160"/>
+        </w:tabs>
+        <w:ind w:left="2160" w:hanging="360"/>
+      </w:pPr>
+      <w:rPr>
+        <w:rFonts w:ascii="Wingdings" w:hAnsi="Wingdings" w:hint="default"/>
+        <w:sz w:val="20"/>
+      </w:rPr>
+    </w:lvl>
+    <w:lvl w:ilvl="3" w:tentative="1">
+      <w:start w:val="1"/>
+      <w:numFmt w:val="bullet"/>
+      <w:lvlText w:val=""/>
+      <w:lvlJc w:val="left"/>
+      <w:pPr>
+        <w:tabs>
+          <w:tab w:val="num" w:pos="2880"/>
+        </w:tabs>
+        <w:ind w:left="2880" w:hanging="360"/>
+      </w:pPr>
+      <w:rPr>
+        <w:rFonts w:ascii="Wingdings" w:hAnsi="Wingdings" w:hint="default"/>
+        <w:sz w:val="20"/>
+      </w:rPr>
+    </w:lvl>
+    <w:lvl w:ilvl="4" w:tentative="1">
+      <w:start w:val="1"/>
+      <w:numFmt w:val="bullet"/>
+      <w:lvlText w:val=""/>
+      <w:lvlJc w:val="left"/>
+      <w:pPr>
+        <w:tabs>
+          <w:tab w:val="num" w:pos="3600"/>
+        </w:tabs>
+        <w:ind w:left="3600" w:hanging="360"/>
+      </w:pPr>
+      <w:rPr>
+        <w:rFonts w:ascii="Wingdings" w:hAnsi="Wingdings" w:hint="default"/>
+        <w:sz w:val="20"/>
+      </w:rPr>
+    </w:lvl>
+    <w:lvl w:ilvl="5" w:tentative="1">
+      <w:start w:val="1"/>
+      <w:numFmt w:val="bullet"/>
+      <w:lvlText w:val=""/>
+      <w:lvlJc w:val="left"/>
+      <w:pPr>
+        <w:tabs>
+          <w:tab w:val="num" w:pos="4320"/>
+        </w:tabs>
+        <w:ind w:left="4320" w:hanging="360"/>
+      </w:pPr>
+      <w:rPr>
+        <w:rFonts w:ascii="Wingdings" w:hAnsi="Wingdings" w:hint="default"/>
+        <w:sz w:val="20"/>
+      </w:rPr>
+    </w:lvl>
+    <w:lvl w:ilvl="6" w:tentative="1">
+      <w:start w:val="1"/>
+      <w:numFmt w:val="bullet"/>
+      <w:lvlText w:val=""/>
+      <w:lvlJc w:val="left"/>
+      <w:pPr>
+        <w:tabs>
+          <w:tab w:val="num" w:pos="5040"/>
+        </w:tabs>
+        <w:ind w:left="5040" w:hanging="360"/>
+      </w:pPr>
+      <w:rPr>
+        <w:rFonts w:ascii="Wingdings" w:hAnsi="Wingdings" w:hint="default"/>
+        <w:sz w:val="20"/>
+      </w:rPr>
+    </w:lvl>
+    <w:lvl w:ilvl="7" w:tentative="1">
+      <w:start w:val="1"/>
+      <w:numFmt w:val="bullet"/>
+      <w:lvlText w:val=""/>
+      <w:lvlJc w:val="left"/>
+      <w:pPr>
+        <w:tabs>
+          <w:tab w:val="num" w:pos="5760"/>
+        </w:tabs>
+        <w:ind w:left="5760" w:hanging="360"/>
+      </w:pPr>
+      <w:rPr>
+        <w:rFonts w:ascii="Wingdings" w:hAnsi="Wingdings" w:hint="default"/>
+        <w:sz w:val="20"/>
+      </w:rPr>
+    </w:lvl>
+    <w:lvl w:ilvl="8" w:tentative="1">
+      <w:start w:val="1"/>
+      <w:numFmt w:val="bullet"/>
+      <w:lvlText w:val=""/>
+      <w:lvlJc w:val="left"/>
+      <w:pPr>
+        <w:tabs>
+          <w:tab w:val="num" w:pos="6480"/>
+        </w:tabs>
+        <w:ind w:left="6480" w:hanging="360"/>
+      </w:pPr>
+      <w:rPr>
+        <w:rFonts w:ascii="Wingdings" w:hAnsi="Wingdings" w:hint="default"/>
+        <w:sz w:val="20"/>
+      </w:rPr>
+    </w:lvl>
+  </w:abstractNum>
+  <w:abstractNum w:abstractNumId="8" w15:restartNumberingAfterBreak="0">
     <w:nsid w:val="76AF5CFC"/>
     <w:multiLevelType w:val="multilevel"/>
     <w:tmpl w:val="F830DB0E"/>
@@ -1446,23 +2672,336 @@
       </w:pPr>
     </w:lvl>
   </w:abstractNum>
+  <w:abstractNum w:abstractNumId="9" w15:restartNumberingAfterBreak="0">
+    <w:nsid w:val="7CD71DA8"/>
+    <w:multiLevelType w:val="multilevel"/>
+    <w:tmpl w:val="F1284AA0"/>
+    <w:lvl w:ilvl="0">
+      <w:start w:val="1"/>
+      <w:numFmt w:val="bullet"/>
+      <w:lvlText w:val=""/>
+      <w:lvlJc w:val="left"/>
+      <w:pPr>
+        <w:tabs>
+          <w:tab w:val="num" w:pos="720"/>
+        </w:tabs>
+        <w:ind w:left="720" w:hanging="360"/>
+      </w:pPr>
+      <w:rPr>
+        <w:rFonts w:ascii="Symbol" w:hAnsi="Symbol" w:hint="default"/>
+        <w:sz w:val="20"/>
+      </w:rPr>
+    </w:lvl>
+    <w:lvl w:ilvl="1">
+      <w:start w:val="1"/>
+      <w:numFmt w:val="bullet"/>
+      <w:lvlText w:val="o"/>
+      <w:lvlJc w:val="left"/>
+      <w:pPr>
+        <w:tabs>
+          <w:tab w:val="num" w:pos="1440"/>
+        </w:tabs>
+        <w:ind w:left="1440" w:hanging="360"/>
+      </w:pPr>
+      <w:rPr>
+        <w:rFonts w:ascii="Courier New" w:hAnsi="Courier New" w:hint="default"/>
+        <w:sz w:val="20"/>
+      </w:rPr>
+    </w:lvl>
+    <w:lvl w:ilvl="2" w:tentative="1">
+      <w:start w:val="1"/>
+      <w:numFmt w:val="bullet"/>
+      <w:lvlText w:val=""/>
+      <w:lvlJc w:val="left"/>
+      <w:pPr>
+        <w:tabs>
+          <w:tab w:val="num" w:pos="2160"/>
+        </w:tabs>
+        <w:ind w:left="2160" w:hanging="360"/>
+      </w:pPr>
+      <w:rPr>
+        <w:rFonts w:ascii="Wingdings" w:hAnsi="Wingdings" w:hint="default"/>
+        <w:sz w:val="20"/>
+      </w:rPr>
+    </w:lvl>
+    <w:lvl w:ilvl="3" w:tentative="1">
+      <w:start w:val="1"/>
+      <w:numFmt w:val="bullet"/>
+      <w:lvlText w:val=""/>
+      <w:lvlJc w:val="left"/>
+      <w:pPr>
+        <w:tabs>
+          <w:tab w:val="num" w:pos="2880"/>
+        </w:tabs>
+        <w:ind w:left="2880" w:hanging="360"/>
+      </w:pPr>
+      <w:rPr>
+        <w:rFonts w:ascii="Wingdings" w:hAnsi="Wingdings" w:hint="default"/>
+        <w:sz w:val="20"/>
+      </w:rPr>
+    </w:lvl>
+    <w:lvl w:ilvl="4" w:tentative="1">
+      <w:start w:val="1"/>
+      <w:numFmt w:val="bullet"/>
+      <w:lvlText w:val=""/>
+      <w:lvlJc w:val="left"/>
+      <w:pPr>
+        <w:tabs>
+          <w:tab w:val="num" w:pos="3600"/>
+        </w:tabs>
+        <w:ind w:left="3600" w:hanging="360"/>
+      </w:pPr>
+      <w:rPr>
+        <w:rFonts w:ascii="Wingdings" w:hAnsi="Wingdings" w:hint="default"/>
+        <w:sz w:val="20"/>
+      </w:rPr>
+    </w:lvl>
+    <w:lvl w:ilvl="5" w:tentative="1">
+      <w:start w:val="1"/>
+      <w:numFmt w:val="bullet"/>
+      <w:lvlText w:val=""/>
+      <w:lvlJc w:val="left"/>
+      <w:pPr>
+        <w:tabs>
+          <w:tab w:val="num" w:pos="4320"/>
+        </w:tabs>
+        <w:ind w:left="4320" w:hanging="360"/>
+      </w:pPr>
+      <w:rPr>
+        <w:rFonts w:ascii="Wingdings" w:hAnsi="Wingdings" w:hint="default"/>
+        <w:sz w:val="20"/>
+      </w:rPr>
+    </w:lvl>
+    <w:lvl w:ilvl="6" w:tentative="1">
+      <w:start w:val="1"/>
+      <w:numFmt w:val="bullet"/>
+      <w:lvlText w:val=""/>
+      <w:lvlJc w:val="left"/>
+      <w:pPr>
+        <w:tabs>
+          <w:tab w:val="num" w:pos="5040"/>
+        </w:tabs>
+        <w:ind w:left="5040" w:hanging="360"/>
+      </w:pPr>
+      <w:rPr>
+        <w:rFonts w:ascii="Wingdings" w:hAnsi="Wingdings" w:hint="default"/>
+        <w:sz w:val="20"/>
+      </w:rPr>
+    </w:lvl>
+    <w:lvl w:ilvl="7" w:tentative="1">
+      <w:start w:val="1"/>
+      <w:numFmt w:val="bullet"/>
+      <w:lvlText w:val=""/>
+      <w:lvlJc w:val="left"/>
+      <w:pPr>
+        <w:tabs>
+          <w:tab w:val="num" w:pos="5760"/>
+        </w:tabs>
+        <w:ind w:left="5760" w:hanging="360"/>
+      </w:pPr>
+      <w:rPr>
+        <w:rFonts w:ascii="Wingdings" w:hAnsi="Wingdings" w:hint="default"/>
+        <w:sz w:val="20"/>
+      </w:rPr>
+    </w:lvl>
+    <w:lvl w:ilvl="8" w:tentative="1">
+      <w:start w:val="1"/>
+      <w:numFmt w:val="bullet"/>
+      <w:lvlText w:val=""/>
+      <w:lvlJc w:val="left"/>
+      <w:pPr>
+        <w:tabs>
+          <w:tab w:val="num" w:pos="6480"/>
+        </w:tabs>
+        <w:ind w:left="6480" w:hanging="360"/>
+      </w:pPr>
+      <w:rPr>
+        <w:rFonts w:ascii="Wingdings" w:hAnsi="Wingdings" w:hint="default"/>
+        <w:sz w:val="20"/>
+      </w:rPr>
+    </w:lvl>
+  </w:abstractNum>
+  <w:abstractNum w:abstractNumId="10" w15:restartNumberingAfterBreak="0">
+    <w:nsid w:val="7F08171F"/>
+    <w:multiLevelType w:val="multilevel"/>
+    <w:tmpl w:val="4AC4D244"/>
+    <w:lvl w:ilvl="0">
+      <w:start w:val="1"/>
+      <w:numFmt w:val="bullet"/>
+      <w:lvlText w:val=""/>
+      <w:lvlJc w:val="left"/>
+      <w:pPr>
+        <w:tabs>
+          <w:tab w:val="num" w:pos="720"/>
+        </w:tabs>
+        <w:ind w:left="720" w:hanging="360"/>
+      </w:pPr>
+      <w:rPr>
+        <w:rFonts w:ascii="Symbol" w:hAnsi="Symbol" w:hint="default"/>
+        <w:sz w:val="20"/>
+      </w:rPr>
+    </w:lvl>
+    <w:lvl w:ilvl="1" w:tentative="1">
+      <w:start w:val="1"/>
+      <w:numFmt w:val="bullet"/>
+      <w:lvlText w:val="o"/>
+      <w:lvlJc w:val="left"/>
+      <w:pPr>
+        <w:tabs>
+          <w:tab w:val="num" w:pos="1440"/>
+        </w:tabs>
+        <w:ind w:left="1440" w:hanging="360"/>
+      </w:pPr>
+      <w:rPr>
+        <w:rFonts w:ascii="Courier New" w:hAnsi="Courier New" w:hint="default"/>
+        <w:sz w:val="20"/>
+      </w:rPr>
+    </w:lvl>
+    <w:lvl w:ilvl="2" w:tentative="1">
+      <w:start w:val="1"/>
+      <w:numFmt w:val="bullet"/>
+      <w:lvlText w:val=""/>
+      <w:lvlJc w:val="left"/>
+      <w:pPr>
+        <w:tabs>
+          <w:tab w:val="num" w:pos="2160"/>
+        </w:tabs>
+        <w:ind w:left="2160" w:hanging="360"/>
+      </w:pPr>
+      <w:rPr>
+        <w:rFonts w:ascii="Wingdings" w:hAnsi="Wingdings" w:hint="default"/>
+        <w:sz w:val="20"/>
+      </w:rPr>
+    </w:lvl>
+    <w:lvl w:ilvl="3" w:tentative="1">
+      <w:start w:val="1"/>
+      <w:numFmt w:val="bullet"/>
+      <w:lvlText w:val=""/>
+      <w:lvlJc w:val="left"/>
+      <w:pPr>
+        <w:tabs>
+          <w:tab w:val="num" w:pos="2880"/>
+        </w:tabs>
+        <w:ind w:left="2880" w:hanging="360"/>
+      </w:pPr>
+      <w:rPr>
+        <w:rFonts w:ascii="Wingdings" w:hAnsi="Wingdings" w:hint="default"/>
+        <w:sz w:val="20"/>
+      </w:rPr>
+    </w:lvl>
+    <w:lvl w:ilvl="4" w:tentative="1">
+      <w:start w:val="1"/>
+      <w:numFmt w:val="bullet"/>
+      <w:lvlText w:val=""/>
+      <w:lvlJc w:val="left"/>
+      <w:pPr>
+        <w:tabs>
+          <w:tab w:val="num" w:pos="3600"/>
+        </w:tabs>
+        <w:ind w:left="3600" w:hanging="360"/>
+      </w:pPr>
+      <w:rPr>
+        <w:rFonts w:ascii="Wingdings" w:hAnsi="Wingdings" w:hint="default"/>
+        <w:sz w:val="20"/>
+      </w:rPr>
+    </w:lvl>
+    <w:lvl w:ilvl="5" w:tentative="1">
+      <w:start w:val="1"/>
+      <w:numFmt w:val="bullet"/>
+      <w:lvlText w:val=""/>
+      <w:lvlJc w:val="left"/>
+      <w:pPr>
+        <w:tabs>
+          <w:tab w:val="num" w:pos="4320"/>
+        </w:tabs>
+        <w:ind w:left="4320" w:hanging="360"/>
+      </w:pPr>
+      <w:rPr>
+        <w:rFonts w:ascii="Wingdings" w:hAnsi="Wingdings" w:hint="default"/>
+        <w:sz w:val="20"/>
+      </w:rPr>
+    </w:lvl>
+    <w:lvl w:ilvl="6" w:tentative="1">
+      <w:start w:val="1"/>
+      <w:numFmt w:val="bullet"/>
+      <w:lvlText w:val=""/>
+      <w:lvlJc w:val="left"/>
+      <w:pPr>
+        <w:tabs>
+          <w:tab w:val="num" w:pos="5040"/>
+        </w:tabs>
+        <w:ind w:left="5040" w:hanging="360"/>
+      </w:pPr>
+      <w:rPr>
+        <w:rFonts w:ascii="Wingdings" w:hAnsi="Wingdings" w:hint="default"/>
+        <w:sz w:val="20"/>
+      </w:rPr>
+    </w:lvl>
+    <w:lvl w:ilvl="7" w:tentative="1">
+      <w:start w:val="1"/>
+      <w:numFmt w:val="bullet"/>
+      <w:lvlText w:val=""/>
+      <w:lvlJc w:val="left"/>
+      <w:pPr>
+        <w:tabs>
+          <w:tab w:val="num" w:pos="5760"/>
+        </w:tabs>
+        <w:ind w:left="5760" w:hanging="360"/>
+      </w:pPr>
+      <w:rPr>
+        <w:rFonts w:ascii="Wingdings" w:hAnsi="Wingdings" w:hint="default"/>
+        <w:sz w:val="20"/>
+      </w:rPr>
+    </w:lvl>
+    <w:lvl w:ilvl="8" w:tentative="1">
+      <w:start w:val="1"/>
+      <w:numFmt w:val="bullet"/>
+      <w:lvlText w:val=""/>
+      <w:lvlJc w:val="left"/>
+      <w:pPr>
+        <w:tabs>
+          <w:tab w:val="num" w:pos="6480"/>
+        </w:tabs>
+        <w:ind w:left="6480" w:hanging="360"/>
+      </w:pPr>
+      <w:rPr>
+        <w:rFonts w:ascii="Wingdings" w:hAnsi="Wingdings" w:hint="default"/>
+        <w:sz w:val="20"/>
+      </w:rPr>
+    </w:lvl>
+  </w:abstractNum>
   <w:num w:numId="1" w16cid:durableId="1214347341">
-    <w:abstractNumId w:val="1"/>
+    <w:abstractNumId w:val="3"/>
   </w:num>
   <w:num w:numId="2" w16cid:durableId="660735199">
-    <w:abstractNumId w:val="5"/>
+    <w:abstractNumId w:val="8"/>
   </w:num>
   <w:num w:numId="3" w16cid:durableId="1559973878">
     <w:abstractNumId w:val="0"/>
   </w:num>
   <w:num w:numId="4" w16cid:durableId="604386679">
+    <w:abstractNumId w:val="6"/>
+  </w:num>
+  <w:num w:numId="5" w16cid:durableId="1695154490">
+    <w:abstractNumId w:val="5"/>
+  </w:num>
+  <w:num w:numId="6" w16cid:durableId="896546618">
     <w:abstractNumId w:val="4"/>
   </w:num>
-  <w:num w:numId="5" w16cid:durableId="1695154490">
-    <w:abstractNumId w:val="3"/>
+  <w:num w:numId="7" w16cid:durableId="791560373">
+    <w:abstractNumId w:val="9"/>
   </w:num>
-  <w:num w:numId="6" w16cid:durableId="896546618">
+  <w:num w:numId="8" w16cid:durableId="838931900">
     <w:abstractNumId w:val="2"/>
+  </w:num>
+  <w:num w:numId="9" w16cid:durableId="1639653365">
+    <w:abstractNumId w:val="7"/>
+  </w:num>
+  <w:num w:numId="10" w16cid:durableId="2100130599">
+    <w:abstractNumId w:val="1"/>
+  </w:num>
+  <w:num w:numId="11" w16cid:durableId="269240696">
+    <w:abstractNumId w:val="10"/>
   </w:num>
 </w:numbering>
 </file>
@@ -2383,6 +3922,29 @@
       <w:spacing w:val="5"/>
     </w:rPr>
   </w:style>
+  <w:style w:type="character" w:styleId="Hipervnculo">
+    <w:name w:val="Hyperlink"/>
+    <w:basedOn w:val="Fuentedeprrafopredeter"/>
+    <w:uiPriority w:val="99"/>
+    <w:unhideWhenUsed/>
+    <w:rsid w:val="00F64573"/>
+    <w:rPr>
+      <w:color w:val="0563C1" w:themeColor="hyperlink"/>
+      <w:u w:val="single"/>
+    </w:rPr>
+  </w:style>
+  <w:style w:type="character" w:styleId="Mencinsinresolver">
+    <w:name w:val="Unresolved Mention"/>
+    <w:basedOn w:val="Fuentedeprrafopredeter"/>
+    <w:uiPriority w:val="99"/>
+    <w:semiHidden/>
+    <w:unhideWhenUsed/>
+    <w:rsid w:val="00F64573"/>
+    <w:rPr>
+      <w:color w:val="605E5C"/>
+      <w:shd w:val="clear" w:color="auto" w:fill="E1DFDD"/>
+    </w:rPr>
+  </w:style>
 </w:styles>
 </file>
 

</xml_diff>